<commit_message>
Rebuild Practical 6 report from reference format
</commit_message>
<xml_diff>
--- a/pract-6-awdf-24cs105.docx
+++ b/pract-6-awdf-24cs105.docx
@@ -2756,15 +2756,14 @@
             <w:pPr>
               <w:jc w:val="left"/>
             </w:pPr>
-            <w:r>
-              <w:t>GitHub Link Repository Link: https://github.com/24CS105-RUDRA/24CS105-AWDF-Practical6</w:t>
-            </w:r>
+            <w:r/>
             <w:r>
               <w:rPr>
                 <w:rFonts w:ascii="Times New Roman" w:hAnsi="Times New Roman"/>
                 <w:b/>
                 <w:sz w:val="22"/>
               </w:rPr>
+              <w:t xml:space="preserve">GitHub Link Repository Link: </w:t>
             </w:r>
             <w:r>
               <w:rPr>
@@ -2772,6 +2771,7 @@
                 <w:b/>
                 <w:sz w:val="22"/>
               </w:rPr>
+              <w:t>https://github.com/24CS105-RUDRA/24CS105-AWDF-Practical6</w:t>
             </w:r>
           </w:p>
         </w:tc>
@@ -3250,6 +3250,17 @@
           <w:szCs w:val="24"/>
         </w:rPr>
       </w:pPr>
+    </w:p>
+    <w:p>
+      <w:r>
+        <w:rPr>
+          <w:b/>
+        </w:rPr>
+        <w:t xml:space="preserve">Student Information: </w:t>
+      </w:r>
+      <w:r>
+        <w:t>Rudra Vaghela | ID: 24CS105 | Email: 24cs105@charusat.edu.in | Semester: 5th Sem | Program: B.Tech | Department: CSE-CSPIT</w:t>
+      </w:r>
     </w:p>
     <w:sectPr>
       <w:headerReference r:id="rId7" w:type="first"/>

</xml_diff>

<commit_message>
Add visible output screenshot to Practical 6 report
</commit_message>
<xml_diff>
--- a/pract-6-awdf-24cs105.docx
+++ b/pract-6-awdf-24cs105.docx
@@ -3260,6 +3260,50 @@
       </w:r>
       <w:r>
         <w:t>Rudra Vaghela | ID: 24CS105 | Email: 24cs105@charusat.edu.in | Semester: 5th Sem | Program: B.Tech | Department: CSE-CSPIT</w:t>
+      </w:r>
+    </w:p>
+    <w:p>
+      <w:r>
+        <w:rPr>
+          <w:b/>
+        </w:rPr>
+        <w:t>Current Application Output Screenshot - Practical 6</w:t>
+      </w:r>
+    </w:p>
+    <w:p>
+      <w:r>
+        <w:drawing>
+          <wp:inline xmlns:a="http://schemas.openxmlformats.org/drawingml/2006/main" xmlns:pic="http://schemas.openxmlformats.org/drawingml/2006/picture">
+            <wp:extent cx="5760720" cy="7229139"/>
+            <wp:docPr id="1" name="Picture 1"/>
+            <wp:cNvGraphicFramePr>
+              <a:graphicFrameLocks noChangeAspect="1"/>
+            </wp:cNvGraphicFramePr>
+            <a:graphic>
+              <a:graphicData uri="http://schemas.openxmlformats.org/drawingml/2006/picture">
+                <pic:pic>
+                  <pic:nvPicPr>
+                    <pic:cNvPr id="0" name="rudra-practical-6-screenshot.png"/>
+                    <pic:cNvPicPr/>
+                  </pic:nvPicPr>
+                  <pic:blipFill>
+                    <a:blip r:embed="rId21"/>
+                    <a:stretch>
+                      <a:fillRect/>
+                    </a:stretch>
+                  </pic:blipFill>
+                  <pic:spPr>
+                    <a:xfrm>
+                      <a:off x="0" y="0"/>
+                      <a:ext cx="5760720" cy="7229139"/>
+                    </a:xfrm>
+                    <a:prstGeom prst="rect"/>
+                  </pic:spPr>
+                </pic:pic>
+              </a:graphicData>
+            </a:graphic>
+          </wp:inline>
+        </w:drawing>
       </w:r>
     </w:p>
     <w:sectPr>

</xml_diff>

<commit_message>
Remove default screenshot from Practical 6 report
</commit_message>
<xml_diff>
--- a/pract-6-awdf-24cs105.docx
+++ b/pract-6-awdf-24cs105.docx
@@ -3260,50 +3260,6 @@
       </w:r>
       <w:r>
         <w:t>Rudra Vaghela | ID: 24CS105 | Email: 24cs105@charusat.edu.in | Semester: 5th Sem | Program: B.Tech | Department: CSE-CSPIT</w:t>
-      </w:r>
-    </w:p>
-    <w:p>
-      <w:r>
-        <w:rPr>
-          <w:b/>
-        </w:rPr>
-        <w:t>Current Application Output Screenshot - Practical 6</w:t>
-      </w:r>
-    </w:p>
-    <w:p>
-      <w:r>
-        <w:drawing>
-          <wp:inline xmlns:a="http://schemas.openxmlformats.org/drawingml/2006/main" xmlns:pic="http://schemas.openxmlformats.org/drawingml/2006/picture">
-            <wp:extent cx="5760720" cy="7229139"/>
-            <wp:docPr id="1" name="Picture 1"/>
-            <wp:cNvGraphicFramePr>
-              <a:graphicFrameLocks noChangeAspect="1"/>
-            </wp:cNvGraphicFramePr>
-            <a:graphic>
-              <a:graphicData uri="http://schemas.openxmlformats.org/drawingml/2006/picture">
-                <pic:pic>
-                  <pic:nvPicPr>
-                    <pic:cNvPr id="0" name="rudra-practical-6-screenshot.png"/>
-                    <pic:cNvPicPr/>
-                  </pic:nvPicPr>
-                  <pic:blipFill>
-                    <a:blip r:embed="rId21"/>
-                    <a:stretch>
-                      <a:fillRect/>
-                    </a:stretch>
-                  </pic:blipFill>
-                  <pic:spPr>
-                    <a:xfrm>
-                      <a:off x="0" y="0"/>
-                      <a:ext cx="5760720" cy="7229139"/>
-                    </a:xfrm>
-                    <a:prstGeom prst="rect"/>
-                  </pic:spPr>
-                </pic:pic>
-              </a:graphicData>
-            </a:graphic>
-          </wp:inline>
-        </w:drawing>
       </w:r>
     </w:p>
     <w:sectPr>

</xml_diff>